<commit_message>
Added PT3 of AI4Research
</commit_message>
<xml_diff>
--- a/Documents/DSDP - Cohort Introduction.docx
+++ b/Documents/DSDP - Cohort Introduction.docx
@@ -1,6 +1,6 @@
 
 <file path=word/document.xml><?xml version="1.0" encoding="utf-8"?>
-<w:document xmlns:wpc="http://schemas.microsoft.com/office/word/2010/wordprocessingCanvas" xmlns:cx="http://schemas.microsoft.com/office/drawing/2014/chartex" xmlns:cx1="http://schemas.microsoft.com/office/drawing/2015/9/8/chartex" xmlns:cx2="http://schemas.microsoft.com/office/drawing/2015/10/21/chartex" xmlns:cx3="http://schemas.microsoft.com/office/drawing/2016/5/9/chartex" xmlns:cx4="http://schemas.microsoft.com/office/drawing/2016/5/10/chartex" xmlns:cx5="http://schemas.microsoft.com/office/drawing/2016/5/11/chartex" xmlns:cx6="http://schemas.microsoft.com/office/drawing/2016/5/12/chartex" xmlns:cx7="http://schemas.microsoft.com/office/drawing/2016/5/13/chartex" xmlns:cx8="http://schemas.microsoft.com/office/drawing/2016/5/14/chartex" xmlns:mc="http://schemas.openxmlformats.org/markup-compatibility/2006" xmlns:aink="http://schemas.microsoft.com/office/drawing/2016/ink" xmlns:am3d="http://schemas.microsoft.com/office/drawing/2017/model3d" xmlns:o="urn:schemas-microsoft-com:office:office" xmlns:oel="http://schemas.microsoft.com/office/2019/extlst" xmlns:r="http://schemas.openxmlformats.org/officeDocument/2006/relationships" xmlns:m="http://schemas.openxmlformats.org/officeDocument/2006/math" xmlns:v="urn:schemas-microsoft-com:vml" xmlns:wp14="http://schemas.microsoft.com/office/word/2010/wordprocessingDrawing" xmlns:wp="http://schemas.openxmlformats.org/drawingml/2006/wordprocessingDrawing" xmlns:w10="urn:schemas-microsoft-com:office:word" xmlns:w="http://schemas.openxmlformats.org/wordprocessingml/2006/main" xmlns:w14="http://schemas.microsoft.com/office/word/2010/wordml" xmlns:w15="http://schemas.microsoft.com/office/word/2012/wordml" xmlns:w16cex="http://schemas.microsoft.com/office/word/2018/wordml/cex" xmlns:w16cid="http://schemas.microsoft.com/office/word/2016/wordml/cid" xmlns:w16="http://schemas.microsoft.com/office/word/2018/wordml" xmlns:w16du="http://schemas.microsoft.com/office/word/2023/wordml/word16du" xmlns:w16sdtdh="http://schemas.microsoft.com/office/word/2020/wordml/sdtdatahash" xmlns:w16sdtfl="http://schemas.microsoft.com/office/word/2024/wordml/sdtformatlock" xmlns:w16se="http://schemas.microsoft.com/office/word/2015/wordml/symex" xmlns:wpg="http://schemas.microsoft.com/office/word/2010/wordprocessingGroup" xmlns:wpi="http://schemas.microsoft.com/office/word/2010/wordprocessingInk" xmlns:wne="http://schemas.microsoft.com/office/word/2006/wordml" xmlns:wps="http://schemas.microsoft.com/office/word/2010/wordprocessingShape" mc:Ignorable="w14 w15 w16se w16cid w16 w16cex w16sdtdh w16sdtfl w16du wp14">
+<w:document xmlns:wpc="http://schemas.microsoft.com/office/word/2010/wordprocessingCanvas" xmlns:cx="http://schemas.microsoft.com/office/drawing/2014/chartex" xmlns:cx1="http://schemas.microsoft.com/office/drawing/2015/9/8/chartex" xmlns:cx2="http://schemas.microsoft.com/office/drawing/2015/10/21/chartex" xmlns:cx3="http://schemas.microsoft.com/office/drawing/2016/5/9/chartex" xmlns:cx4="http://schemas.microsoft.com/office/drawing/2016/5/10/chartex" xmlns:cx5="http://schemas.microsoft.com/office/drawing/2016/5/11/chartex" xmlns:cx6="http://schemas.microsoft.com/office/drawing/2016/5/12/chartex" xmlns:cx7="http://schemas.microsoft.com/office/drawing/2016/5/13/chartex" xmlns:cx8="http://schemas.microsoft.com/office/drawing/2016/5/14/chartex" xmlns:mc="http://schemas.openxmlformats.org/markup-compatibility/2006" xmlns:m="http://schemas.openxmlformats.org/officeDocument/2006/math" xmlns:aink="http://schemas.microsoft.com/office/drawing/2016/ink" xmlns:am3d="http://schemas.microsoft.com/office/drawing/2017/model3d" xmlns:oel="http://schemas.microsoft.com/office/2019/extlst" xmlns:r="http://schemas.openxmlformats.org/officeDocument/2006/relationships" xmlns:wp14="http://schemas.microsoft.com/office/word/2010/wordprocessingDrawing" xmlns:wp="http://schemas.openxmlformats.org/drawingml/2006/wordprocessingDrawing" xmlns:wpg="http://schemas.microsoft.com/office/word/2010/wordprocessingGroup" xmlns:wpi="http://schemas.microsoft.com/office/word/2010/wordprocessingInk" xmlns:wps="http://schemas.microsoft.com/office/word/2010/wordprocessingShape" xmlns:o="urn:schemas-microsoft-com:office:office" xmlns:v="urn:schemas-microsoft-com:vml" xmlns:w10="urn:schemas-microsoft-com:office:word" xmlns:w="http://schemas.openxmlformats.org/wordprocessingml/2006/main" xmlns:w14="http://schemas.microsoft.com/office/word/2010/wordml" xmlns:w15="http://schemas.microsoft.com/office/word/2012/wordml" xmlns:w16cex="http://schemas.microsoft.com/office/word/2018/wordml/cex" xmlns:w16cid="http://schemas.microsoft.com/office/word/2016/wordml/cid" xmlns:w16="http://schemas.microsoft.com/office/word/2018/wordml" xmlns:w16sdtdh="http://schemas.microsoft.com/office/word/2020/wordml/sdtdatahash" xmlns:w16sdtfl="http://schemas.microsoft.com/office/word/2024/wordml/sdtformatlock" xmlns:w16se="http://schemas.microsoft.com/office/word/2015/wordml/symex" xmlns:w16du="http://schemas.microsoft.com/office/word/2023/wordml/word16du" xmlns:wne="http://schemas.microsoft.com/office/word/2006/wordml" mc:Ignorable="w14 w15 w16se w16cid w16 w16cex w16sdtdh w16sdtfl w16du wp14">
   <w:body>
     <w:p>
       <w:pPr>
@@ -66,14 +66,7 @@
           <w:rFonts w:ascii="Arial" w:eastAsia="Times New Roman" w:hAnsi="Arial" w:cs="Arial"/>
           <w:lang w:eastAsia="en-GB"/>
         </w:rPr>
-        <w:t xml:space="preserve">Dear </w:t>
-      </w:r>
-      <w:r>
-        <w:rPr>
-          <w:rFonts w:ascii="Arial" w:eastAsia="Times New Roman" w:hAnsi="Arial" w:cs="Arial"/>
-          <w:lang w:eastAsia="en-GB"/>
-        </w:rPr>
-        <w:t>Students,</w:t>
+        <w:t>Dear Students,</w:t>
       </w:r>
     </w:p>
     <w:p>
@@ -81,15 +74,67 @@
         <w:spacing w:before="100" w:beforeAutospacing="1" w:after="100" w:afterAutospacing="1"/>
         <w:rPr>
           <w:rFonts w:ascii="Arial" w:eastAsia="Times New Roman" w:hAnsi="Arial" w:cs="Arial"/>
-          <w:lang w:eastAsia="en-GB"/>
-        </w:rPr>
-      </w:pPr>
-      <w:r>
-        <w:rPr>
-          <w:rFonts w:ascii="Arial" w:eastAsia="Times New Roman" w:hAnsi="Arial" w:cs="Arial"/>
-          <w:lang w:eastAsia="en-GB"/>
-        </w:rPr>
-        <w:t xml:space="preserve">We are delighted to welcome you to the </w:t>
+          <w:b/>
+          <w:bCs/>
+          <w:lang w:eastAsia="en-GB"/>
+        </w:rPr>
+      </w:pPr>
+      <w:r>
+        <w:rPr>
+          <w:rFonts w:ascii="Arial" w:eastAsia="Times New Roman" w:hAnsi="Arial" w:cs="Arial"/>
+          <w:lang w:eastAsia="en-GB"/>
+        </w:rPr>
+        <w:t>We are delighted to welcome you to the</w:t>
+      </w:r>
+      <w:r>
+        <w:rPr>
+          <w:rFonts w:ascii="Arial" w:eastAsia="Times New Roman" w:hAnsi="Arial" w:cs="Arial"/>
+          <w:b/>
+          <w:bCs/>
+          <w:lang w:eastAsia="en-GB"/>
+        </w:rPr>
+        <w:t xml:space="preserve"> </w:t>
+      </w:r>
+      <w:r>
+        <w:rPr>
+          <w:rFonts w:ascii="Arial" w:eastAsia="Times New Roman" w:hAnsi="Arial" w:cs="Arial"/>
+          <w:b/>
+          <w:bCs/>
+          <w:lang w:eastAsia="en-GB"/>
+        </w:rPr>
+        <w:t xml:space="preserve">Essential Digital Skills </w:t>
+      </w:r>
+      <w:r>
+        <w:rPr>
+          <w:rFonts w:ascii="Arial" w:eastAsia="Times New Roman" w:hAnsi="Arial" w:cs="Arial"/>
+          <w:b/>
+          <w:bCs/>
+          <w:lang w:eastAsia="en-GB"/>
+        </w:rPr>
+        <w:t>C</w:t>
+      </w:r>
+      <w:r>
+        <w:rPr>
+          <w:rFonts w:ascii="Arial" w:eastAsia="Times New Roman" w:hAnsi="Arial" w:cs="Arial"/>
+          <w:b/>
+          <w:bCs/>
+          <w:lang w:eastAsia="en-GB"/>
+        </w:rPr>
+        <w:t>ourse</w:t>
+      </w:r>
+      <w:r>
+        <w:rPr>
+          <w:rFonts w:ascii="Arial" w:eastAsia="Times New Roman" w:hAnsi="Arial" w:cs="Arial"/>
+          <w:lang w:eastAsia="en-GB"/>
+        </w:rPr>
+        <w:t>, a part of the</w:t>
+      </w:r>
+      <w:r>
+        <w:rPr>
+          <w:rFonts w:ascii="Arial" w:eastAsia="Times New Roman" w:hAnsi="Arial" w:cs="Arial"/>
+          <w:lang w:eastAsia="en-GB"/>
+        </w:rPr>
+        <w:t xml:space="preserve"> </w:t>
       </w:r>
       <w:r>
         <w:rPr>
@@ -107,14 +152,71 @@
           <w:bCs/>
           <w:lang w:eastAsia="en-GB"/>
         </w:rPr>
-        <w:t xml:space="preserve">, </w:t>
-      </w:r>
-      <w:r>
-        <w:rPr>
-          <w:rFonts w:ascii="Arial" w:eastAsia="Times New Roman" w:hAnsi="Arial" w:cs="Arial"/>
-          <w:lang w:eastAsia="en-GB"/>
-        </w:rPr>
-        <w:t>a one-year, tiered in-person training pathway designed to equip doctoral researchers with the core digital competencies required for modern, reproducible, and data-intensive research.</w:t>
+        <w:t xml:space="preserve"> </w:t>
+      </w:r>
+      <w:r>
+        <w:rPr>
+          <w:rFonts w:ascii="Arial" w:eastAsia="Times New Roman" w:hAnsi="Arial" w:cs="Arial"/>
+          <w:lang w:eastAsia="en-GB"/>
+        </w:rPr>
+        <w:t xml:space="preserve">developed </w:t>
+      </w:r>
+      <w:r>
+        <w:rPr>
+          <w:rFonts w:ascii="Arial" w:eastAsia="Times New Roman" w:hAnsi="Arial" w:cs="Arial"/>
+          <w:lang w:eastAsia="en-GB"/>
+        </w:rPr>
+        <w:t xml:space="preserve">by the University of Nottingham </w:t>
+      </w:r>
+      <w:r>
+        <w:rPr>
+          <w:rFonts w:ascii="Arial" w:eastAsia="Times New Roman" w:hAnsi="Arial" w:cs="Arial"/>
+          <w:b/>
+          <w:bCs/>
+          <w:lang w:eastAsia="en-GB"/>
+        </w:rPr>
+        <w:t>Digital Research Service</w:t>
+      </w:r>
+      <w:r>
+        <w:rPr>
+          <w:rFonts w:ascii="Arial" w:eastAsia="Times New Roman" w:hAnsi="Arial" w:cs="Arial"/>
+          <w:lang w:eastAsia="en-GB"/>
+        </w:rPr>
+        <w:t xml:space="preserve"> </w:t>
+      </w:r>
+      <w:r>
+        <w:rPr>
+          <w:rFonts w:ascii="Arial" w:eastAsia="Times New Roman" w:hAnsi="Arial" w:cs="Arial"/>
+          <w:lang w:eastAsia="en-GB"/>
+        </w:rPr>
+        <w:t xml:space="preserve">for the </w:t>
+      </w:r>
+      <w:r>
+        <w:rPr>
+          <w:rFonts w:ascii="Arial" w:eastAsia="Times New Roman" w:hAnsi="Arial" w:cs="Arial"/>
+          <w:b/>
+          <w:bCs/>
+          <w:lang w:eastAsia="en-GB"/>
+        </w:rPr>
+        <w:t xml:space="preserve">BBSRC Doctoral Training </w:t>
+      </w:r>
+      <w:r>
+        <w:rPr>
+          <w:rFonts w:ascii="Arial" w:eastAsia="Times New Roman" w:hAnsi="Arial" w:cs="Arial"/>
+          <w:b/>
+          <w:bCs/>
+          <w:lang w:eastAsia="en-GB"/>
+        </w:rPr>
+        <w:t>Programme</w:t>
+      </w:r>
+      <w:r>
+        <w:rPr>
+          <w:rFonts w:ascii="Arial" w:eastAsia="Times New Roman" w:hAnsi="Arial" w:cs="Arial"/>
+          <w:b/>
+          <w:bCs/>
+          <w:lang w:eastAsia="en-GB"/>
+        </w:rPr>
+        <w:t>.</w:t>
       </w:r>
     </w:p>
     <w:p>
@@ -160,16 +262,11 @@
       <w:r>
         <w:rPr>
           <w:rFonts w:ascii="Arial" w:eastAsia="Times New Roman" w:hAnsi="Arial" w:cs="Arial"/>
-          <w:lang w:eastAsia="en-GB"/>
-        </w:rPr>
-        <w:t xml:space="preserve">All students will </w:t>
-      </w:r>
-      <w:r>
-        <w:rPr>
-          <w:rFonts w:ascii="Arial" w:eastAsia="Times New Roman" w:hAnsi="Arial" w:cs="Arial"/>
-          <w:lang w:eastAsia="en-GB"/>
-        </w:rPr>
-        <w:t xml:space="preserve">undertake the </w:t>
+          <w:b/>
+          <w:bCs/>
+          <w:lang w:eastAsia="en-GB"/>
+        </w:rPr>
+        <w:t xml:space="preserve">The </w:t>
       </w:r>
       <w:r>
         <w:rPr>
@@ -183,9 +280,20 @@
       <w:r>
         <w:rPr>
           <w:rFonts w:ascii="Arial" w:eastAsia="Times New Roman" w:hAnsi="Arial" w:cs="Arial"/>
-          <w:lang w:eastAsia="en-GB"/>
-        </w:rPr>
-        <w:t>course</w:t>
+          <w:b/>
+          <w:bCs/>
+          <w:lang w:eastAsia="en-GB"/>
+        </w:rPr>
+        <w:t>C</w:t>
+      </w:r>
+      <w:r>
+        <w:rPr>
+          <w:rFonts w:ascii="Arial" w:eastAsia="Times New Roman" w:hAnsi="Arial" w:cs="Arial"/>
+          <w:b/>
+          <w:bCs/>
+          <w:lang w:eastAsia="en-GB"/>
+        </w:rPr>
+        <w:t>ourse</w:t>
       </w:r>
       <w:r>
         <w:rPr>
@@ -201,21 +309,28 @@
           <w:rFonts w:ascii="Arial" w:eastAsia="Times New Roman" w:hAnsi="Arial" w:cs="Arial"/>
           <w:lang w:eastAsia="en-GB"/>
         </w:rPr>
-        <w:t>which provides the core baseline in digital research literacy</w:t>
-      </w:r>
-      <w:r>
-        <w:rPr>
-          <w:rFonts w:ascii="Arial" w:eastAsia="Times New Roman" w:hAnsi="Arial" w:cs="Arial"/>
-          <w:lang w:eastAsia="en-GB"/>
-        </w:rPr>
-        <w:t xml:space="preserve">. </w:t>
-      </w:r>
-      <w:r>
-        <w:rPr>
-          <w:rFonts w:ascii="Arial" w:eastAsia="Times New Roman" w:hAnsi="Arial" w:cs="Arial"/>
-          <w:lang w:eastAsia="en-GB"/>
-        </w:rPr>
-        <w:t>It is designed to equip you with the fundamental digital competencies, institutional knowledge, and research practices needed to operate effectively within the University of Nottingham’s data-intensive research environment.</w:t>
+        <w:t>has been</w:t>
+      </w:r>
+      <w:r>
+        <w:rPr>
+          <w:rFonts w:ascii="Arial" w:eastAsia="Times New Roman" w:hAnsi="Arial" w:cs="Arial"/>
+          <w:lang w:eastAsia="en-GB"/>
+        </w:rPr>
+        <w:t xml:space="preserve"> designed to equip </w:t>
+      </w:r>
+      <w:r>
+        <w:rPr>
+          <w:rFonts w:ascii="Arial" w:eastAsia="Times New Roman" w:hAnsi="Arial" w:cs="Arial"/>
+          <w:lang w:eastAsia="en-GB"/>
+        </w:rPr>
+        <w:t>student</w:t>
+      </w:r>
+      <w:r>
+        <w:rPr>
+          <w:rFonts w:ascii="Arial" w:eastAsia="Times New Roman" w:hAnsi="Arial" w:cs="Arial"/>
+          <w:lang w:eastAsia="en-GB"/>
+        </w:rPr>
+        <w:t xml:space="preserve"> with the fundamental digital competencies, institutional knowledge, and research practices needed to operate effectively within the University of Nottingham’s data-intensive research environment.</w:t>
       </w:r>
     </w:p>
     <w:p>
@@ -262,7 +377,43 @@
           <w:bCs/>
           <w:lang w:eastAsia="en-GB"/>
         </w:rPr>
-        <w:t>four half-day in-person sessions</w:t>
+        <w:t>8</w:t>
+      </w:r>
+      <w:r>
+        <w:rPr>
+          <w:rFonts w:ascii="Arial" w:eastAsia="Times New Roman" w:hAnsi="Arial" w:cs="Arial"/>
+          <w:b/>
+          <w:bCs/>
+          <w:lang w:eastAsia="en-GB"/>
+        </w:rPr>
+        <w:t xml:space="preserve"> x</w:t>
+      </w:r>
+      <w:r>
+        <w:rPr>
+          <w:rFonts w:ascii="Arial" w:eastAsia="Times New Roman" w:hAnsi="Arial" w:cs="Arial"/>
+          <w:b/>
+          <w:bCs/>
+          <w:lang w:eastAsia="en-GB"/>
+        </w:rPr>
+        <w:t xml:space="preserve"> </w:t>
+      </w:r>
+      <w:r>
+        <w:rPr>
+          <w:rFonts w:ascii="Arial" w:eastAsia="Times New Roman" w:hAnsi="Arial" w:cs="Arial"/>
+          <w:b/>
+          <w:bCs/>
+          <w:lang w:eastAsia="en-GB"/>
+        </w:rPr>
+        <w:t>2h</w:t>
+      </w:r>
+      <w:r>
+        <w:rPr>
+          <w:rFonts w:ascii="Arial" w:eastAsia="Times New Roman" w:hAnsi="Arial" w:cs="Arial"/>
+          <w:b/>
+          <w:bCs/>
+          <w:lang w:eastAsia="en-GB"/>
+        </w:rPr>
+        <w:t xml:space="preserve"> in-person sessions</w:t>
       </w:r>
       <w:r>
         <w:rPr>
@@ -399,14 +550,22 @@
     </w:p>
     <w:p>
       <w:pPr>
+        <w:rPr>
+          <w:rFonts w:ascii="Arial" w:eastAsia="Times New Roman" w:hAnsi="Arial" w:cs="Arial"/>
+          <w:b/>
+          <w:bCs/>
+          <w:lang w:eastAsia="en-GB"/>
+        </w:rPr>
+      </w:pPr>
+    </w:p>
+    <w:p>
+      <w:pPr>
         <w:spacing w:before="100" w:beforeAutospacing="1" w:after="100" w:afterAutospacing="1"/>
         <w:outlineLvl w:val="2"/>
         <w:rPr>
           <w:rFonts w:ascii="Arial" w:eastAsia="Times New Roman" w:hAnsi="Arial" w:cs="Arial"/>
           <w:b/>
           <w:bCs/>
-          <w:sz w:val="27"/>
-          <w:szCs w:val="27"/>
           <w:lang w:eastAsia="en-GB"/>
         </w:rPr>
       </w:pPr>
@@ -429,16 +588,7 @@
           <w:bCs/>
           <w:lang w:eastAsia="en-GB"/>
         </w:rPr>
-        <w:t>Session Details</w:t>
-      </w:r>
-      <w:r>
-        <w:rPr>
-          <w:rFonts w:ascii="Arial" w:eastAsia="Times New Roman" w:hAnsi="Arial" w:cs="Arial"/>
-          <w:b/>
-          <w:bCs/>
-          <w:lang w:eastAsia="en-GB"/>
-        </w:rPr>
-        <w:t>:</w:t>
+        <w:t>Session Details:</w:t>
       </w:r>
     </w:p>
     <w:p>
@@ -470,9 +620,9 @@
         <w:tblLook w:val="04A0" w:firstRow="1" w:lastRow="0" w:firstColumn="1" w:lastColumn="0" w:noHBand="0" w:noVBand="1"/>
       </w:tblPr>
       <w:tblGrid>
-        <w:gridCol w:w="3104"/>
-        <w:gridCol w:w="1528"/>
-        <w:gridCol w:w="3691"/>
+        <w:gridCol w:w="596"/>
+        <w:gridCol w:w="1608"/>
+        <w:gridCol w:w="1075"/>
       </w:tblGrid>
       <w:tr>
         <w:trPr>
@@ -580,7 +730,7 @@
                 <w:rFonts w:ascii="Arial" w:eastAsia="Times New Roman" w:hAnsi="Arial" w:cs="Arial"/>
                 <w:lang w:eastAsia="en-GB"/>
               </w:rPr>
-              <w:t>Tuesday 14 October 2025</w:t>
+              <w:t>TBC</w:t>
             </w:r>
           </w:p>
         </w:tc>
@@ -602,7 +752,28 @@
                 <w:rFonts w:ascii="Arial" w:eastAsia="Times New Roman" w:hAnsi="Arial" w:cs="Arial"/>
                 <w:lang w:eastAsia="en-GB"/>
               </w:rPr>
-              <w:t>1:00–5:00 pm</w:t>
+              <w:t>N</w:t>
+            </w:r>
+            <w:r>
+              <w:rPr>
+                <w:rFonts w:ascii="Arial" w:eastAsia="Times New Roman" w:hAnsi="Arial" w:cs="Arial"/>
+                <w:lang w:eastAsia="en-GB"/>
+              </w:rPr>
+              <w:t>:00–</w:t>
+            </w:r>
+            <w:r>
+              <w:rPr>
+                <w:rFonts w:ascii="Arial" w:eastAsia="Times New Roman" w:hAnsi="Arial" w:cs="Arial"/>
+                <w:lang w:eastAsia="en-GB"/>
+              </w:rPr>
+              <w:t>N</w:t>
+            </w:r>
+            <w:r>
+              <w:rPr>
+                <w:rFonts w:ascii="Arial" w:eastAsia="Times New Roman" w:hAnsi="Arial" w:cs="Arial"/>
+                <w:lang w:eastAsia="en-GB"/>
+              </w:rPr>
+              <w:t>:00 pm</w:t>
             </w:r>
           </w:p>
         </w:tc>
@@ -624,7 +795,14 @@
                 <w:rFonts w:ascii="Arial" w:eastAsia="Times New Roman" w:hAnsi="Arial" w:cs="Arial"/>
                 <w:lang w:eastAsia="en-GB"/>
               </w:rPr>
-              <w:t xml:space="preserve">Room A81, Life Sciences Building </w:t>
+              <w:t xml:space="preserve">Room </w:t>
+            </w:r>
+            <w:r>
+              <w:rPr>
+                <w:rFonts w:ascii="Arial" w:eastAsia="Times New Roman" w:hAnsi="Arial" w:cs="Arial"/>
+                <w:lang w:eastAsia="en-GB"/>
+              </w:rPr>
+              <w:t>X</w:t>
             </w:r>
           </w:p>
         </w:tc>
@@ -651,7 +829,7 @@
                 <w:rFonts w:ascii="Arial" w:eastAsia="Times New Roman" w:hAnsi="Arial" w:cs="Arial"/>
                 <w:lang w:eastAsia="en-GB"/>
               </w:rPr>
-              <w:t>Tuesday 20 November 2025</w:t>
+              <w:t>TBC</w:t>
             </w:r>
           </w:p>
         </w:tc>
@@ -673,7 +851,28 @@
                 <w:rFonts w:ascii="Arial" w:eastAsia="Times New Roman" w:hAnsi="Arial" w:cs="Arial"/>
                 <w:lang w:eastAsia="en-GB"/>
               </w:rPr>
-              <w:t>1:00–5:00 pm</w:t>
+              <w:t>N</w:t>
+            </w:r>
+            <w:r>
+              <w:rPr>
+                <w:rFonts w:ascii="Arial" w:eastAsia="Times New Roman" w:hAnsi="Arial" w:cs="Arial"/>
+                <w:lang w:eastAsia="en-GB"/>
+              </w:rPr>
+              <w:t>:00–</w:t>
+            </w:r>
+            <w:r>
+              <w:rPr>
+                <w:rFonts w:ascii="Arial" w:eastAsia="Times New Roman" w:hAnsi="Arial" w:cs="Arial"/>
+                <w:lang w:eastAsia="en-GB"/>
+              </w:rPr>
+              <w:t>N</w:t>
+            </w:r>
+            <w:r>
+              <w:rPr>
+                <w:rFonts w:ascii="Arial" w:eastAsia="Times New Roman" w:hAnsi="Arial" w:cs="Arial"/>
+                <w:lang w:eastAsia="en-GB"/>
+              </w:rPr>
+              <w:t>:00 pm</w:t>
             </w:r>
           </w:p>
         </w:tc>
@@ -695,7 +894,14 @@
                 <w:rFonts w:ascii="Arial" w:eastAsia="Times New Roman" w:hAnsi="Arial" w:cs="Arial"/>
                 <w:lang w:eastAsia="en-GB"/>
               </w:rPr>
-              <w:t>Room A81, Life Sciences Building</w:t>
+              <w:t xml:space="preserve">Room </w:t>
+            </w:r>
+            <w:r>
+              <w:rPr>
+                <w:rFonts w:ascii="Arial" w:eastAsia="Times New Roman" w:hAnsi="Arial" w:cs="Arial"/>
+                <w:lang w:eastAsia="en-GB"/>
+              </w:rPr>
+              <w:t>X</w:t>
             </w:r>
           </w:p>
         </w:tc>
@@ -722,7 +928,7 @@
                 <w:rFonts w:ascii="Arial" w:eastAsia="Times New Roman" w:hAnsi="Arial" w:cs="Arial"/>
                 <w:lang w:eastAsia="en-GB"/>
               </w:rPr>
-              <w:t>Tuesday 16 December 2025</w:t>
+              <w:t>TBC</w:t>
             </w:r>
           </w:p>
         </w:tc>
@@ -744,7 +950,28 @@
                 <w:rFonts w:ascii="Arial" w:eastAsia="Times New Roman" w:hAnsi="Arial" w:cs="Arial"/>
                 <w:lang w:eastAsia="en-GB"/>
               </w:rPr>
-              <w:t>1:00–5:00 pm</w:t>
+              <w:t>N</w:t>
+            </w:r>
+            <w:r>
+              <w:rPr>
+                <w:rFonts w:ascii="Arial" w:eastAsia="Times New Roman" w:hAnsi="Arial" w:cs="Arial"/>
+                <w:lang w:eastAsia="en-GB"/>
+              </w:rPr>
+              <w:t>:00–</w:t>
+            </w:r>
+            <w:r>
+              <w:rPr>
+                <w:rFonts w:ascii="Arial" w:eastAsia="Times New Roman" w:hAnsi="Arial" w:cs="Arial"/>
+                <w:lang w:eastAsia="en-GB"/>
+              </w:rPr>
+              <w:t>N</w:t>
+            </w:r>
+            <w:r>
+              <w:rPr>
+                <w:rFonts w:ascii="Arial" w:eastAsia="Times New Roman" w:hAnsi="Arial" w:cs="Arial"/>
+                <w:lang w:eastAsia="en-GB"/>
+              </w:rPr>
+              <w:t>:00 pm</w:t>
             </w:r>
           </w:p>
         </w:tc>
@@ -766,7 +993,14 @@
                 <w:rFonts w:ascii="Arial" w:eastAsia="Times New Roman" w:hAnsi="Arial" w:cs="Arial"/>
                 <w:lang w:eastAsia="en-GB"/>
               </w:rPr>
-              <w:t>Room A81, Life Sciences Building</w:t>
+              <w:t xml:space="preserve">Room </w:t>
+            </w:r>
+            <w:r>
+              <w:rPr>
+                <w:rFonts w:ascii="Arial" w:eastAsia="Times New Roman" w:hAnsi="Arial" w:cs="Arial"/>
+                <w:lang w:eastAsia="en-GB"/>
+              </w:rPr>
+              <w:t>X</w:t>
             </w:r>
           </w:p>
         </w:tc>
@@ -793,7 +1027,7 @@
                 <w:rFonts w:ascii="Arial" w:eastAsia="Times New Roman" w:hAnsi="Arial" w:cs="Arial"/>
                 <w:lang w:eastAsia="en-GB"/>
               </w:rPr>
-              <w:t>Tuesday 13 January 2026</w:t>
+              <w:t>TBC</w:t>
             </w:r>
           </w:p>
         </w:tc>
@@ -815,7 +1049,28 @@
                 <w:rFonts w:ascii="Arial" w:eastAsia="Times New Roman" w:hAnsi="Arial" w:cs="Arial"/>
                 <w:lang w:eastAsia="en-GB"/>
               </w:rPr>
-              <w:t>1:00–5:00 pm</w:t>
+              <w:t>N</w:t>
+            </w:r>
+            <w:r>
+              <w:rPr>
+                <w:rFonts w:ascii="Arial" w:eastAsia="Times New Roman" w:hAnsi="Arial" w:cs="Arial"/>
+                <w:lang w:eastAsia="en-GB"/>
+              </w:rPr>
+              <w:t>:00–</w:t>
+            </w:r>
+            <w:r>
+              <w:rPr>
+                <w:rFonts w:ascii="Arial" w:eastAsia="Times New Roman" w:hAnsi="Arial" w:cs="Arial"/>
+                <w:lang w:eastAsia="en-GB"/>
+              </w:rPr>
+              <w:t>N</w:t>
+            </w:r>
+            <w:r>
+              <w:rPr>
+                <w:rFonts w:ascii="Arial" w:eastAsia="Times New Roman" w:hAnsi="Arial" w:cs="Arial"/>
+                <w:lang w:eastAsia="en-GB"/>
+              </w:rPr>
+              <w:t>:00 pm</w:t>
             </w:r>
           </w:p>
         </w:tc>
@@ -837,7 +1092,398 @@
                 <w:rFonts w:ascii="Arial" w:eastAsia="Times New Roman" w:hAnsi="Arial" w:cs="Arial"/>
                 <w:lang w:eastAsia="en-GB"/>
               </w:rPr>
-              <w:t>Room A81, Life Sciences Building</w:t>
+              <w:t xml:space="preserve">Room </w:t>
+            </w:r>
+            <w:r>
+              <w:rPr>
+                <w:rFonts w:ascii="Arial" w:eastAsia="Times New Roman" w:hAnsi="Arial" w:cs="Arial"/>
+                <w:lang w:eastAsia="en-GB"/>
+              </w:rPr>
+              <w:t>X</w:t>
+            </w:r>
+          </w:p>
+        </w:tc>
+      </w:tr>
+      <w:tr>
+        <w:trPr>
+          <w:tblCellSpacing w:w="15" w:type="dxa"/>
+        </w:trPr>
+        <w:tc>
+          <w:tcPr>
+            <w:tcW w:w="0" w:type="auto"/>
+            <w:vAlign w:val="center"/>
+          </w:tcPr>
+          <w:p>
+            <w:pPr>
+              <w:rPr>
+                <w:rFonts w:ascii="Arial" w:eastAsia="Times New Roman" w:hAnsi="Arial" w:cs="Arial"/>
+                <w:lang w:eastAsia="en-GB"/>
+              </w:rPr>
+            </w:pPr>
+            <w:r>
+              <w:rPr>
+                <w:rFonts w:ascii="Arial" w:eastAsia="Times New Roman" w:hAnsi="Arial" w:cs="Arial"/>
+                <w:lang w:eastAsia="en-GB"/>
+              </w:rPr>
+              <w:t>TBC</w:t>
+            </w:r>
+          </w:p>
+        </w:tc>
+        <w:tc>
+          <w:tcPr>
+            <w:tcW w:w="0" w:type="auto"/>
+            <w:vAlign w:val="center"/>
+          </w:tcPr>
+          <w:p>
+            <w:pPr>
+              <w:rPr>
+                <w:rFonts w:ascii="Arial" w:eastAsia="Times New Roman" w:hAnsi="Arial" w:cs="Arial"/>
+                <w:lang w:eastAsia="en-GB"/>
+              </w:rPr>
+            </w:pPr>
+            <w:r>
+              <w:rPr>
+                <w:rFonts w:ascii="Arial" w:eastAsia="Times New Roman" w:hAnsi="Arial" w:cs="Arial"/>
+                <w:lang w:eastAsia="en-GB"/>
+              </w:rPr>
+              <w:t>N</w:t>
+            </w:r>
+            <w:r>
+              <w:rPr>
+                <w:rFonts w:ascii="Arial" w:eastAsia="Times New Roman" w:hAnsi="Arial" w:cs="Arial"/>
+                <w:lang w:eastAsia="en-GB"/>
+              </w:rPr>
+              <w:t>:00–</w:t>
+            </w:r>
+            <w:r>
+              <w:rPr>
+                <w:rFonts w:ascii="Arial" w:eastAsia="Times New Roman" w:hAnsi="Arial" w:cs="Arial"/>
+                <w:lang w:eastAsia="en-GB"/>
+              </w:rPr>
+              <w:t>N</w:t>
+            </w:r>
+            <w:r>
+              <w:rPr>
+                <w:rFonts w:ascii="Arial" w:eastAsia="Times New Roman" w:hAnsi="Arial" w:cs="Arial"/>
+                <w:lang w:eastAsia="en-GB"/>
+              </w:rPr>
+              <w:t>:00 pm</w:t>
+            </w:r>
+          </w:p>
+        </w:tc>
+        <w:tc>
+          <w:tcPr>
+            <w:tcW w:w="0" w:type="auto"/>
+            <w:vAlign w:val="center"/>
+          </w:tcPr>
+          <w:p>
+            <w:pPr>
+              <w:rPr>
+                <w:rFonts w:ascii="Arial" w:eastAsia="Times New Roman" w:hAnsi="Arial" w:cs="Arial"/>
+                <w:lang w:eastAsia="en-GB"/>
+              </w:rPr>
+            </w:pPr>
+            <w:r>
+              <w:rPr>
+                <w:rFonts w:ascii="Arial" w:eastAsia="Times New Roman" w:hAnsi="Arial" w:cs="Arial"/>
+                <w:lang w:eastAsia="en-GB"/>
+              </w:rPr>
+              <w:t xml:space="preserve">Room </w:t>
+            </w:r>
+            <w:r>
+              <w:rPr>
+                <w:rFonts w:ascii="Arial" w:eastAsia="Times New Roman" w:hAnsi="Arial" w:cs="Arial"/>
+                <w:lang w:eastAsia="en-GB"/>
+              </w:rPr>
+              <w:t>X</w:t>
+            </w:r>
+          </w:p>
+        </w:tc>
+      </w:tr>
+      <w:tr>
+        <w:trPr>
+          <w:tblCellSpacing w:w="15" w:type="dxa"/>
+        </w:trPr>
+        <w:tc>
+          <w:tcPr>
+            <w:tcW w:w="0" w:type="auto"/>
+            <w:vAlign w:val="center"/>
+          </w:tcPr>
+          <w:p>
+            <w:pPr>
+              <w:rPr>
+                <w:rFonts w:ascii="Arial" w:eastAsia="Times New Roman" w:hAnsi="Arial" w:cs="Arial"/>
+                <w:lang w:eastAsia="en-GB"/>
+              </w:rPr>
+            </w:pPr>
+            <w:r>
+              <w:rPr>
+                <w:rFonts w:ascii="Arial" w:eastAsia="Times New Roman" w:hAnsi="Arial" w:cs="Arial"/>
+                <w:lang w:eastAsia="en-GB"/>
+              </w:rPr>
+              <w:t>TBC</w:t>
+            </w:r>
+          </w:p>
+        </w:tc>
+        <w:tc>
+          <w:tcPr>
+            <w:tcW w:w="0" w:type="auto"/>
+            <w:vAlign w:val="center"/>
+          </w:tcPr>
+          <w:p>
+            <w:pPr>
+              <w:rPr>
+                <w:rFonts w:ascii="Arial" w:eastAsia="Times New Roman" w:hAnsi="Arial" w:cs="Arial"/>
+                <w:lang w:eastAsia="en-GB"/>
+              </w:rPr>
+            </w:pPr>
+            <w:r>
+              <w:rPr>
+                <w:rFonts w:ascii="Arial" w:eastAsia="Times New Roman" w:hAnsi="Arial" w:cs="Arial"/>
+                <w:lang w:eastAsia="en-GB"/>
+              </w:rPr>
+              <w:t>N</w:t>
+            </w:r>
+            <w:r>
+              <w:rPr>
+                <w:rFonts w:ascii="Arial" w:eastAsia="Times New Roman" w:hAnsi="Arial" w:cs="Arial"/>
+                <w:lang w:eastAsia="en-GB"/>
+              </w:rPr>
+              <w:t>:00–</w:t>
+            </w:r>
+            <w:r>
+              <w:rPr>
+                <w:rFonts w:ascii="Arial" w:eastAsia="Times New Roman" w:hAnsi="Arial" w:cs="Arial"/>
+                <w:lang w:eastAsia="en-GB"/>
+              </w:rPr>
+              <w:t>N</w:t>
+            </w:r>
+            <w:r>
+              <w:rPr>
+                <w:rFonts w:ascii="Arial" w:eastAsia="Times New Roman" w:hAnsi="Arial" w:cs="Arial"/>
+                <w:lang w:eastAsia="en-GB"/>
+              </w:rPr>
+              <w:t>:00 pm</w:t>
+            </w:r>
+          </w:p>
+        </w:tc>
+        <w:tc>
+          <w:tcPr>
+            <w:tcW w:w="0" w:type="auto"/>
+            <w:vAlign w:val="center"/>
+          </w:tcPr>
+          <w:p>
+            <w:pPr>
+              <w:rPr>
+                <w:rFonts w:ascii="Arial" w:eastAsia="Times New Roman" w:hAnsi="Arial" w:cs="Arial"/>
+                <w:lang w:eastAsia="en-GB"/>
+              </w:rPr>
+            </w:pPr>
+            <w:r>
+              <w:rPr>
+                <w:rFonts w:ascii="Arial" w:eastAsia="Times New Roman" w:hAnsi="Arial" w:cs="Arial"/>
+                <w:lang w:eastAsia="en-GB"/>
+              </w:rPr>
+              <w:t xml:space="preserve">Room </w:t>
+            </w:r>
+            <w:r>
+              <w:rPr>
+                <w:rFonts w:ascii="Arial" w:eastAsia="Times New Roman" w:hAnsi="Arial" w:cs="Arial"/>
+                <w:lang w:eastAsia="en-GB"/>
+              </w:rPr>
+              <w:t>X</w:t>
+            </w:r>
+          </w:p>
+        </w:tc>
+      </w:tr>
+      <w:tr>
+        <w:trPr>
+          <w:tblCellSpacing w:w="15" w:type="dxa"/>
+        </w:trPr>
+        <w:tc>
+          <w:tcPr>
+            <w:tcW w:w="0" w:type="auto"/>
+            <w:vAlign w:val="center"/>
+          </w:tcPr>
+          <w:p>
+            <w:pPr>
+              <w:rPr>
+                <w:rFonts w:ascii="Arial" w:eastAsia="Times New Roman" w:hAnsi="Arial" w:cs="Arial"/>
+                <w:lang w:eastAsia="en-GB"/>
+              </w:rPr>
+            </w:pPr>
+            <w:r>
+              <w:rPr>
+                <w:rFonts w:ascii="Arial" w:eastAsia="Times New Roman" w:hAnsi="Arial" w:cs="Arial"/>
+                <w:lang w:eastAsia="en-GB"/>
+              </w:rPr>
+              <w:t>TBC</w:t>
+            </w:r>
+          </w:p>
+        </w:tc>
+        <w:tc>
+          <w:tcPr>
+            <w:tcW w:w="0" w:type="auto"/>
+            <w:vAlign w:val="center"/>
+          </w:tcPr>
+          <w:p>
+            <w:pPr>
+              <w:rPr>
+                <w:rFonts w:ascii="Arial" w:eastAsia="Times New Roman" w:hAnsi="Arial" w:cs="Arial"/>
+                <w:lang w:eastAsia="en-GB"/>
+              </w:rPr>
+            </w:pPr>
+            <w:r>
+              <w:rPr>
+                <w:rFonts w:ascii="Arial" w:eastAsia="Times New Roman" w:hAnsi="Arial" w:cs="Arial"/>
+                <w:lang w:eastAsia="en-GB"/>
+              </w:rPr>
+              <w:t>N</w:t>
+            </w:r>
+            <w:r>
+              <w:rPr>
+                <w:rFonts w:ascii="Arial" w:eastAsia="Times New Roman" w:hAnsi="Arial" w:cs="Arial"/>
+                <w:lang w:eastAsia="en-GB"/>
+              </w:rPr>
+              <w:t>:00–</w:t>
+            </w:r>
+            <w:r>
+              <w:rPr>
+                <w:rFonts w:ascii="Arial" w:eastAsia="Times New Roman" w:hAnsi="Arial" w:cs="Arial"/>
+                <w:lang w:eastAsia="en-GB"/>
+              </w:rPr>
+              <w:t>N</w:t>
+            </w:r>
+            <w:r>
+              <w:rPr>
+                <w:rFonts w:ascii="Arial" w:eastAsia="Times New Roman" w:hAnsi="Arial" w:cs="Arial"/>
+                <w:lang w:eastAsia="en-GB"/>
+              </w:rPr>
+              <w:t>:00 pm</w:t>
+            </w:r>
+          </w:p>
+        </w:tc>
+        <w:tc>
+          <w:tcPr>
+            <w:tcW w:w="0" w:type="auto"/>
+            <w:vAlign w:val="center"/>
+          </w:tcPr>
+          <w:p>
+            <w:pPr>
+              <w:rPr>
+                <w:rFonts w:ascii="Arial" w:eastAsia="Times New Roman" w:hAnsi="Arial" w:cs="Arial"/>
+                <w:lang w:eastAsia="en-GB"/>
+              </w:rPr>
+            </w:pPr>
+            <w:r>
+              <w:rPr>
+                <w:rFonts w:ascii="Arial" w:eastAsia="Times New Roman" w:hAnsi="Arial" w:cs="Arial"/>
+                <w:lang w:eastAsia="en-GB"/>
+              </w:rPr>
+              <w:t xml:space="preserve">Room </w:t>
+            </w:r>
+            <w:r>
+              <w:rPr>
+                <w:rFonts w:ascii="Arial" w:eastAsia="Times New Roman" w:hAnsi="Arial" w:cs="Arial"/>
+                <w:lang w:eastAsia="en-GB"/>
+              </w:rPr>
+              <w:t>X</w:t>
+            </w:r>
+          </w:p>
+        </w:tc>
+      </w:tr>
+      <w:tr>
+        <w:trPr>
+          <w:tblCellSpacing w:w="15" w:type="dxa"/>
+        </w:trPr>
+        <w:tc>
+          <w:tcPr>
+            <w:tcW w:w="0" w:type="auto"/>
+            <w:vAlign w:val="center"/>
+          </w:tcPr>
+          <w:p>
+            <w:pPr>
+              <w:rPr>
+                <w:rFonts w:ascii="Arial" w:eastAsia="Times New Roman" w:hAnsi="Arial" w:cs="Arial"/>
+                <w:lang w:eastAsia="en-GB"/>
+              </w:rPr>
+            </w:pPr>
+            <w:r>
+              <w:rPr>
+                <w:rFonts w:ascii="Arial" w:eastAsia="Times New Roman" w:hAnsi="Arial" w:cs="Arial"/>
+                <w:lang w:eastAsia="en-GB"/>
+              </w:rPr>
+              <w:t>TBC</w:t>
+            </w:r>
+          </w:p>
+        </w:tc>
+        <w:tc>
+          <w:tcPr>
+            <w:tcW w:w="0" w:type="auto"/>
+            <w:vAlign w:val="center"/>
+          </w:tcPr>
+          <w:p>
+            <w:pPr>
+              <w:rPr>
+                <w:rFonts w:ascii="Arial" w:eastAsia="Times New Roman" w:hAnsi="Arial" w:cs="Arial"/>
+                <w:lang w:eastAsia="en-GB"/>
+              </w:rPr>
+            </w:pPr>
+            <w:r>
+              <w:rPr>
+                <w:rFonts w:ascii="Arial" w:eastAsia="Times New Roman" w:hAnsi="Arial" w:cs="Arial"/>
+                <w:lang w:eastAsia="en-GB"/>
+              </w:rPr>
+              <w:t>N</w:t>
+            </w:r>
+            <w:r>
+              <w:rPr>
+                <w:rFonts w:ascii="Arial" w:eastAsia="Times New Roman" w:hAnsi="Arial" w:cs="Arial"/>
+                <w:lang w:eastAsia="en-GB"/>
+              </w:rPr>
+              <w:t>:00–</w:t>
+            </w:r>
+            <w:r>
+              <w:rPr>
+                <w:rFonts w:ascii="Arial" w:eastAsia="Times New Roman" w:hAnsi="Arial" w:cs="Arial"/>
+                <w:lang w:eastAsia="en-GB"/>
+              </w:rPr>
+              <w:t>N</w:t>
+            </w:r>
+            <w:r>
+              <w:rPr>
+                <w:rFonts w:ascii="Arial" w:eastAsia="Times New Roman" w:hAnsi="Arial" w:cs="Arial"/>
+                <w:lang w:eastAsia="en-GB"/>
+              </w:rPr>
+              <w:t>:00 pm</w:t>
+            </w:r>
+          </w:p>
+        </w:tc>
+        <w:tc>
+          <w:tcPr>
+            <w:tcW w:w="0" w:type="auto"/>
+            <w:vAlign w:val="center"/>
+          </w:tcPr>
+          <w:p>
+            <w:pPr>
+              <w:rPr>
+                <w:rFonts w:ascii="Arial" w:eastAsia="Times New Roman" w:hAnsi="Arial" w:cs="Arial"/>
+                <w:lang w:eastAsia="en-GB"/>
+              </w:rPr>
+            </w:pPr>
+            <w:r>
+              <w:rPr>
+                <w:rFonts w:ascii="Arial" w:eastAsia="Times New Roman" w:hAnsi="Arial" w:cs="Arial"/>
+                <w:lang w:eastAsia="en-GB"/>
+              </w:rPr>
+              <w:t xml:space="preserve">Room </w:t>
+            </w:r>
+            <w:r>
+              <w:rPr>
+                <w:rFonts w:ascii="Arial" w:eastAsia="Times New Roman" w:hAnsi="Arial" w:cs="Arial"/>
+                <w:lang w:eastAsia="en-GB"/>
+              </w:rPr>
+              <w:t>X</w:t>
             </w:r>
           </w:p>
         </w:tc>
@@ -856,14 +1502,7 @@
           <w:rFonts w:ascii="Arial" w:eastAsia="Times New Roman" w:hAnsi="Arial" w:cs="Arial"/>
           <w:lang w:eastAsia="en-GB"/>
         </w:rPr>
-        <w:t xml:space="preserve">A University Park campus map </w:t>
-      </w:r>
-      <w:r>
-        <w:rPr>
-          <w:rFonts w:ascii="Arial" w:eastAsia="Times New Roman" w:hAnsi="Arial" w:cs="Arial"/>
-          <w:lang w:eastAsia="en-GB"/>
-        </w:rPr>
-        <w:t xml:space="preserve">can be found </w:t>
+        <w:t xml:space="preserve">A University Park campus map can be found </w:t>
       </w:r>
       <w:hyperlink r:id="rId7" w:history="1">
         <w:r>
@@ -888,6 +1527,8 @@
         <w:spacing w:before="100" w:beforeAutospacing="1" w:after="100" w:afterAutospacing="1"/>
         <w:rPr>
           <w:rFonts w:ascii="Arial" w:eastAsia="Times New Roman" w:hAnsi="Arial" w:cs="Arial"/>
+          <w:b/>
+          <w:bCs/>
           <w:lang w:eastAsia="en-GB"/>
         </w:rPr>
       </w:pPr>
@@ -900,39 +1541,172 @@
         </w:rPr>
         <w:t>Feedback:</w:t>
       </w:r>
+    </w:p>
+    <w:p>
+      <w:pPr>
+        <w:spacing w:before="100" w:beforeAutospacing="1" w:after="100" w:afterAutospacing="1"/>
+        <w:rPr>
+          <w:rFonts w:ascii="Arial" w:eastAsia="Times New Roman" w:hAnsi="Arial" w:cs="Arial"/>
+          <w:lang w:eastAsia="en-GB"/>
+        </w:rPr>
+      </w:pPr>
+      <w:r>
+        <w:rPr>
+          <w:rFonts w:ascii="Arial" w:eastAsia="Times New Roman" w:hAnsi="Arial" w:cs="Arial"/>
+          <w:lang w:eastAsia="en-GB"/>
+        </w:rPr>
+        <w:t>Feedback will be gathered throughout the programme to help us understand what is working well and where further improvements may be needed. This will include structured post-session surveys, opportunities to provide optional written comments, and informal group reflections during or at the end of sessions. Feedback will be used to refine the content, delivery and supporting materials, helping to ensure that the programme remains relevant, practical and responsive to the needs of researchers.</w:t>
+      </w:r>
+    </w:p>
+    <w:p>
+      <w:pPr>
+        <w:spacing w:before="100" w:beforeAutospacing="1" w:after="100" w:afterAutospacing="1"/>
+        <w:rPr>
+          <w:rFonts w:ascii="Arial" w:eastAsia="Times New Roman" w:hAnsi="Arial" w:cs="Arial"/>
+          <w:b/>
+          <w:bCs/>
+          <w:lang w:eastAsia="en-GB"/>
+        </w:rPr>
+      </w:pPr>
+      <w:r>
+        <w:rPr>
+          <w:rFonts w:ascii="Arial" w:eastAsia="Times New Roman" w:hAnsi="Arial" w:cs="Arial"/>
+          <w:b/>
+          <w:bCs/>
+          <w:lang w:eastAsia="en-GB"/>
+        </w:rPr>
+        <w:t>Digital Skills Clinics:</w:t>
+      </w:r>
+    </w:p>
+    <w:p>
+      <w:pPr>
+        <w:spacing w:before="100" w:beforeAutospacing="1" w:after="100" w:afterAutospacing="1"/>
+        <w:rPr>
+          <w:rFonts w:ascii="Arial" w:eastAsia="Times New Roman" w:hAnsi="Arial" w:cs="Arial"/>
+          <w:lang w:eastAsia="en-GB"/>
+        </w:rPr>
+      </w:pPr>
+      <w:r>
+        <w:rPr>
+          <w:rFonts w:ascii="Arial" w:eastAsia="Times New Roman" w:hAnsi="Arial" w:cs="Arial"/>
+          <w:lang w:eastAsia="en-GB"/>
+        </w:rPr>
+        <w:t>This course is designed not only to provide taught content, but also to connect students with domain experts who can support them in applying these skills to their own research. Alongside the scheduled teaching, members of the</w:t>
+      </w:r>
+      <w:r>
+        <w:rPr>
+          <w:rFonts w:ascii="Arial" w:eastAsia="Times New Roman" w:hAnsi="Arial" w:cs="Arial"/>
+          <w:b/>
+          <w:bCs/>
+          <w:lang w:eastAsia="en-GB"/>
+        </w:rPr>
+        <w:t xml:space="preserve"> Data Science &amp; Digital Skills Team </w:t>
+      </w:r>
+      <w:r>
+        <w:rPr>
+          <w:rFonts w:ascii="Arial" w:eastAsia="Times New Roman" w:hAnsi="Arial" w:cs="Arial"/>
+          <w:lang w:eastAsia="en-GB"/>
+        </w:rPr>
+        <w:t xml:space="preserve">will be available through monthly </w:t>
+      </w:r>
+      <w:r>
+        <w:rPr>
+          <w:rFonts w:ascii="Arial" w:eastAsia="Times New Roman" w:hAnsi="Arial" w:cs="Arial"/>
+          <w:b/>
+          <w:bCs/>
+          <w:lang w:eastAsia="en-GB"/>
+        </w:rPr>
+        <w:t>Digital Skills Clinics</w:t>
+      </w:r>
+      <w:r>
+        <w:rPr>
+          <w:rFonts w:ascii="Arial" w:eastAsia="Times New Roman" w:hAnsi="Arial" w:cs="Arial"/>
+          <w:lang w:eastAsia="en-GB"/>
+        </w:rPr>
+        <w:t>. These sessions will provide an opportunity to bring specific data, coding, analysis or wider digital research challenges, discuss possible approaches, troubleshoot problems, or seek advice on appropriate tools and methods. The clinics are intended to provide flexible, practical support that complements the taught programme and helps participants apply what they have learned to real research problems. Further details, including dates and how to attend, will be provided in due course.</w:t>
+      </w:r>
+    </w:p>
+    <w:p>
+      <w:pPr>
+        <w:rPr>
+          <w:rFonts w:ascii="Arial" w:eastAsia="Times New Roman" w:hAnsi="Arial" w:cs="Arial"/>
+          <w:b/>
+          <w:bCs/>
+          <w:lang w:eastAsia="en-GB"/>
+        </w:rPr>
+      </w:pPr>
+      <w:r>
+        <w:rPr>
+          <w:rFonts w:ascii="Arial" w:eastAsia="Times New Roman" w:hAnsi="Arial" w:cs="Arial"/>
+          <w:b/>
+          <w:bCs/>
+          <w:lang w:eastAsia="en-GB"/>
+        </w:rPr>
+        <w:br w:type="page"/>
+      </w:r>
+    </w:p>
+    <w:p>
+      <w:pPr>
+        <w:spacing w:before="100" w:beforeAutospacing="1" w:after="100" w:afterAutospacing="1"/>
+        <w:rPr>
+          <w:rFonts w:ascii="Arial" w:eastAsia="Times New Roman" w:hAnsi="Arial" w:cs="Arial"/>
+          <w:b/>
+          <w:bCs/>
+          <w:lang w:eastAsia="en-GB"/>
+        </w:rPr>
+      </w:pPr>
+    </w:p>
+    <w:p>
+      <w:pPr>
+        <w:spacing w:before="100" w:beforeAutospacing="1" w:after="100" w:afterAutospacing="1"/>
+        <w:rPr>
+          <w:rFonts w:ascii="Arial" w:eastAsia="Times New Roman" w:hAnsi="Arial" w:cs="Arial"/>
+          <w:b/>
+          <w:bCs/>
+          <w:lang w:eastAsia="en-GB"/>
+        </w:rPr>
+      </w:pPr>
+      <w:r>
+        <w:rPr>
+          <w:rFonts w:ascii="Arial" w:eastAsia="Times New Roman" w:hAnsi="Arial" w:cs="Arial"/>
+          <w:b/>
+          <w:bCs/>
+          <w:lang w:eastAsia="en-GB"/>
+        </w:rPr>
+        <w:t>Participant Outcomes:</w:t>
+      </w:r>
+    </w:p>
+    <w:p>
+      <w:pPr>
+        <w:spacing w:before="100" w:beforeAutospacing="1" w:after="100" w:afterAutospacing="1"/>
+        <w:rPr>
+          <w:rFonts w:ascii="Arial" w:eastAsia="Times New Roman" w:hAnsi="Arial" w:cs="Arial"/>
+          <w:lang w:eastAsia="en-GB"/>
+        </w:rPr>
+      </w:pPr>
       <w:r>
         <w:rPr>
           <w:rFonts w:ascii="Arial" w:eastAsia="Times New Roman" w:hAnsi="Arial" w:cs="Arial"/>
           <w:lang w:eastAsia="en-GB"/>
         </w:rPr>
         <w:br/>
-        <w:t>Feedback will be gathered through structured post-session surveys, optional comments, and informal group reflections to ensure the programme continues to meet researcher needs.</w:t>
-      </w:r>
-    </w:p>
-    <w:p>
-      <w:pPr>
-        <w:spacing w:before="100" w:beforeAutospacing="1" w:after="100" w:afterAutospacing="1"/>
-        <w:rPr>
-          <w:rFonts w:ascii="Arial" w:eastAsia="Times New Roman" w:hAnsi="Arial" w:cs="Arial"/>
-          <w:lang w:eastAsia="en-GB"/>
-        </w:rPr>
-      </w:pPr>
-      <w:r>
-        <w:rPr>
-          <w:rFonts w:ascii="Arial" w:eastAsia="Times New Roman" w:hAnsi="Arial" w:cs="Arial"/>
-          <w:b/>
-          <w:bCs/>
-          <w:lang w:eastAsia="en-GB"/>
-        </w:rPr>
-        <w:t>Participant Outcomes:</w:t>
-      </w:r>
-      <w:r>
-        <w:rPr>
-          <w:rFonts w:ascii="Arial" w:eastAsia="Times New Roman" w:hAnsi="Arial" w:cs="Arial"/>
-          <w:lang w:eastAsia="en-GB"/>
-        </w:rPr>
-        <w:br/>
-        <w:t>By the end of the EDS programme you will have:</w:t>
+        <w:t xml:space="preserve">By the end of the EDS </w:t>
+      </w:r>
+      <w:proofErr w:type="gramStart"/>
+      <w:r>
+        <w:rPr>
+          <w:rFonts w:ascii="Arial" w:eastAsia="Times New Roman" w:hAnsi="Arial" w:cs="Arial"/>
+          <w:lang w:eastAsia="en-GB"/>
+        </w:rPr>
+        <w:t>course</w:t>
+      </w:r>
+      <w:proofErr w:type="gramEnd"/>
+      <w:r>
+        <w:rPr>
+          <w:rFonts w:ascii="Arial" w:eastAsia="Times New Roman" w:hAnsi="Arial" w:cs="Arial"/>
+          <w:lang w:eastAsia="en-GB"/>
+        </w:rPr>
+        <w:t xml:space="preserve"> you will have:</w:t>
       </w:r>
     </w:p>
     <w:p>
@@ -1147,7 +1921,7 @@
 </file>
 
 <file path=word/endnotes.xml><?xml version="1.0" encoding="utf-8"?>
-<w:endnotes xmlns:wpc="http://schemas.microsoft.com/office/word/2010/wordprocessingCanvas" xmlns:cx="http://schemas.microsoft.com/office/drawing/2014/chartex" xmlns:cx1="http://schemas.microsoft.com/office/drawing/2015/9/8/chartex" xmlns:cx2="http://schemas.microsoft.com/office/drawing/2015/10/21/chartex" xmlns:cx3="http://schemas.microsoft.com/office/drawing/2016/5/9/chartex" xmlns:cx4="http://schemas.microsoft.com/office/drawing/2016/5/10/chartex" xmlns:cx5="http://schemas.microsoft.com/office/drawing/2016/5/11/chartex" xmlns:cx6="http://schemas.microsoft.com/office/drawing/2016/5/12/chartex" xmlns:cx7="http://schemas.microsoft.com/office/drawing/2016/5/13/chartex" xmlns:cx8="http://schemas.microsoft.com/office/drawing/2016/5/14/chartex" xmlns:mc="http://schemas.openxmlformats.org/markup-compatibility/2006" xmlns:aink="http://schemas.microsoft.com/office/drawing/2016/ink" xmlns:am3d="http://schemas.microsoft.com/office/drawing/2017/model3d" xmlns:o="urn:schemas-microsoft-com:office:office" xmlns:oel="http://schemas.microsoft.com/office/2019/extlst" xmlns:r="http://schemas.openxmlformats.org/officeDocument/2006/relationships" xmlns:m="http://schemas.openxmlformats.org/officeDocument/2006/math" xmlns:v="urn:schemas-microsoft-com:vml" xmlns:wp14="http://schemas.microsoft.com/office/word/2010/wordprocessingDrawing" xmlns:wp="http://schemas.openxmlformats.org/drawingml/2006/wordprocessingDrawing" xmlns:w10="urn:schemas-microsoft-com:office:word" xmlns:w="http://schemas.openxmlformats.org/wordprocessingml/2006/main" xmlns:w14="http://schemas.microsoft.com/office/word/2010/wordml" xmlns:w15="http://schemas.microsoft.com/office/word/2012/wordml" xmlns:w16cex="http://schemas.microsoft.com/office/word/2018/wordml/cex" xmlns:w16cid="http://schemas.microsoft.com/office/word/2016/wordml/cid" xmlns:w16="http://schemas.microsoft.com/office/word/2018/wordml" xmlns:w16du="http://schemas.microsoft.com/office/word/2023/wordml/word16du" xmlns:w16sdtdh="http://schemas.microsoft.com/office/word/2020/wordml/sdtdatahash" xmlns:w16sdtfl="http://schemas.microsoft.com/office/word/2024/wordml/sdtformatlock" xmlns:w16se="http://schemas.microsoft.com/office/word/2015/wordml/symex" xmlns:wpg="http://schemas.microsoft.com/office/word/2010/wordprocessingGroup" xmlns:wpi="http://schemas.microsoft.com/office/word/2010/wordprocessingInk" xmlns:wne="http://schemas.microsoft.com/office/word/2006/wordml" xmlns:wps="http://schemas.microsoft.com/office/word/2010/wordprocessingShape" mc:Ignorable="w14 w15 w16se w16cid w16 w16cex w16sdtdh w16sdtfl w16du wp14">
+<w:endnotes xmlns:wpc="http://schemas.microsoft.com/office/word/2010/wordprocessingCanvas" xmlns:cx="http://schemas.microsoft.com/office/drawing/2014/chartex" xmlns:cx1="http://schemas.microsoft.com/office/drawing/2015/9/8/chartex" xmlns:cx2="http://schemas.microsoft.com/office/drawing/2015/10/21/chartex" xmlns:cx3="http://schemas.microsoft.com/office/drawing/2016/5/9/chartex" xmlns:cx4="http://schemas.microsoft.com/office/drawing/2016/5/10/chartex" xmlns:cx5="http://schemas.microsoft.com/office/drawing/2016/5/11/chartex" xmlns:cx6="http://schemas.microsoft.com/office/drawing/2016/5/12/chartex" xmlns:cx7="http://schemas.microsoft.com/office/drawing/2016/5/13/chartex" xmlns:cx8="http://schemas.microsoft.com/office/drawing/2016/5/14/chartex" xmlns:mc="http://schemas.openxmlformats.org/markup-compatibility/2006" xmlns:m="http://schemas.openxmlformats.org/officeDocument/2006/math" xmlns:aink="http://schemas.microsoft.com/office/drawing/2016/ink" xmlns:am3d="http://schemas.microsoft.com/office/drawing/2017/model3d" xmlns:oel="http://schemas.microsoft.com/office/2019/extlst" xmlns:r="http://schemas.openxmlformats.org/officeDocument/2006/relationships" xmlns:wp14="http://schemas.microsoft.com/office/word/2010/wordprocessingDrawing" xmlns:wp="http://schemas.openxmlformats.org/drawingml/2006/wordprocessingDrawing" xmlns:wpg="http://schemas.microsoft.com/office/word/2010/wordprocessingGroup" xmlns:wpi="http://schemas.microsoft.com/office/word/2010/wordprocessingInk" xmlns:wps="http://schemas.microsoft.com/office/word/2010/wordprocessingShape" xmlns:o="urn:schemas-microsoft-com:office:office" xmlns:v="urn:schemas-microsoft-com:vml" xmlns:w10="urn:schemas-microsoft-com:office:word" xmlns:w="http://schemas.openxmlformats.org/wordprocessingml/2006/main" xmlns:w14="http://schemas.microsoft.com/office/word/2010/wordml" xmlns:w15="http://schemas.microsoft.com/office/word/2012/wordml" xmlns:w16cex="http://schemas.microsoft.com/office/word/2018/wordml/cex" xmlns:w16cid="http://schemas.microsoft.com/office/word/2016/wordml/cid" xmlns:w16="http://schemas.microsoft.com/office/word/2018/wordml" xmlns:w16sdtdh="http://schemas.microsoft.com/office/word/2020/wordml/sdtdatahash" xmlns:w16sdtfl="http://schemas.microsoft.com/office/word/2024/wordml/sdtformatlock" xmlns:w16se="http://schemas.microsoft.com/office/word/2015/wordml/symex" xmlns:w16du="http://schemas.microsoft.com/office/word/2023/wordml/word16du" xmlns:wne="http://schemas.microsoft.com/office/word/2006/wordml" mc:Ignorable="w14 w15 w16se w16cid w16 w16cex w16sdtdh w16sdtfl w16du wp14">
   <w:endnote w:type="separator" w:id="-1">
     <w:p>
       <w:r>
@@ -1166,7 +1940,7 @@
 </file>
 
 <file path=word/footnotes.xml><?xml version="1.0" encoding="utf-8"?>
-<w:footnotes xmlns:wpc="http://schemas.microsoft.com/office/word/2010/wordprocessingCanvas" xmlns:cx="http://schemas.microsoft.com/office/drawing/2014/chartex" xmlns:cx1="http://schemas.microsoft.com/office/drawing/2015/9/8/chartex" xmlns:cx2="http://schemas.microsoft.com/office/drawing/2015/10/21/chartex" xmlns:cx3="http://schemas.microsoft.com/office/drawing/2016/5/9/chartex" xmlns:cx4="http://schemas.microsoft.com/office/drawing/2016/5/10/chartex" xmlns:cx5="http://schemas.microsoft.com/office/drawing/2016/5/11/chartex" xmlns:cx6="http://schemas.microsoft.com/office/drawing/2016/5/12/chartex" xmlns:cx7="http://schemas.microsoft.com/office/drawing/2016/5/13/chartex" xmlns:cx8="http://schemas.microsoft.com/office/drawing/2016/5/14/chartex" xmlns:mc="http://schemas.openxmlformats.org/markup-compatibility/2006" xmlns:aink="http://schemas.microsoft.com/office/drawing/2016/ink" xmlns:am3d="http://schemas.microsoft.com/office/drawing/2017/model3d" xmlns:o="urn:schemas-microsoft-com:office:office" xmlns:oel="http://schemas.microsoft.com/office/2019/extlst" xmlns:r="http://schemas.openxmlformats.org/officeDocument/2006/relationships" xmlns:m="http://schemas.openxmlformats.org/officeDocument/2006/math" xmlns:v="urn:schemas-microsoft-com:vml" xmlns:wp14="http://schemas.microsoft.com/office/word/2010/wordprocessingDrawing" xmlns:wp="http://schemas.openxmlformats.org/drawingml/2006/wordprocessingDrawing" xmlns:w10="urn:schemas-microsoft-com:office:word" xmlns:w="http://schemas.openxmlformats.org/wordprocessingml/2006/main" xmlns:w14="http://schemas.microsoft.com/office/word/2010/wordml" xmlns:w15="http://schemas.microsoft.com/office/word/2012/wordml" xmlns:w16cex="http://schemas.microsoft.com/office/word/2018/wordml/cex" xmlns:w16cid="http://schemas.microsoft.com/office/word/2016/wordml/cid" xmlns:w16="http://schemas.microsoft.com/office/word/2018/wordml" xmlns:w16du="http://schemas.microsoft.com/office/word/2023/wordml/word16du" xmlns:w16sdtdh="http://schemas.microsoft.com/office/word/2020/wordml/sdtdatahash" xmlns:w16sdtfl="http://schemas.microsoft.com/office/word/2024/wordml/sdtformatlock" xmlns:w16se="http://schemas.microsoft.com/office/word/2015/wordml/symex" xmlns:wpg="http://schemas.microsoft.com/office/word/2010/wordprocessingGroup" xmlns:wpi="http://schemas.microsoft.com/office/word/2010/wordprocessingInk" xmlns:wne="http://schemas.microsoft.com/office/word/2006/wordml" xmlns:wps="http://schemas.microsoft.com/office/word/2010/wordprocessingShape" mc:Ignorable="w14 w15 w16se w16cid w16 w16cex w16sdtdh w16sdtfl w16du wp14">
+<w:footnotes xmlns:wpc="http://schemas.microsoft.com/office/word/2010/wordprocessingCanvas" xmlns:cx="http://schemas.microsoft.com/office/drawing/2014/chartex" xmlns:cx1="http://schemas.microsoft.com/office/drawing/2015/9/8/chartex" xmlns:cx2="http://schemas.microsoft.com/office/drawing/2015/10/21/chartex" xmlns:cx3="http://schemas.microsoft.com/office/drawing/2016/5/9/chartex" xmlns:cx4="http://schemas.microsoft.com/office/drawing/2016/5/10/chartex" xmlns:cx5="http://schemas.microsoft.com/office/drawing/2016/5/11/chartex" xmlns:cx6="http://schemas.microsoft.com/office/drawing/2016/5/12/chartex" xmlns:cx7="http://schemas.microsoft.com/office/drawing/2016/5/13/chartex" xmlns:cx8="http://schemas.microsoft.com/office/drawing/2016/5/14/chartex" xmlns:mc="http://schemas.openxmlformats.org/markup-compatibility/2006" xmlns:m="http://schemas.openxmlformats.org/officeDocument/2006/math" xmlns:aink="http://schemas.microsoft.com/office/drawing/2016/ink" xmlns:am3d="http://schemas.microsoft.com/office/drawing/2017/model3d" xmlns:oel="http://schemas.microsoft.com/office/2019/extlst" xmlns:r="http://schemas.openxmlformats.org/officeDocument/2006/relationships" xmlns:wp14="http://schemas.microsoft.com/office/word/2010/wordprocessingDrawing" xmlns:wp="http://schemas.openxmlformats.org/drawingml/2006/wordprocessingDrawing" xmlns:wpg="http://schemas.microsoft.com/office/word/2010/wordprocessingGroup" xmlns:wpi="http://schemas.microsoft.com/office/word/2010/wordprocessingInk" xmlns:wps="http://schemas.microsoft.com/office/word/2010/wordprocessingShape" xmlns:o="urn:schemas-microsoft-com:office:office" xmlns:v="urn:schemas-microsoft-com:vml" xmlns:w10="urn:schemas-microsoft-com:office:word" xmlns:w="http://schemas.openxmlformats.org/wordprocessingml/2006/main" xmlns:w14="http://schemas.microsoft.com/office/word/2010/wordml" xmlns:w15="http://schemas.microsoft.com/office/word/2012/wordml" xmlns:w16cex="http://schemas.microsoft.com/office/word/2018/wordml/cex" xmlns:w16cid="http://schemas.microsoft.com/office/word/2016/wordml/cid" xmlns:w16="http://schemas.microsoft.com/office/word/2018/wordml" xmlns:w16sdtdh="http://schemas.microsoft.com/office/word/2020/wordml/sdtdatahash" xmlns:w16sdtfl="http://schemas.microsoft.com/office/word/2024/wordml/sdtformatlock" xmlns:w16se="http://schemas.microsoft.com/office/word/2015/wordml/symex" xmlns:w16du="http://schemas.microsoft.com/office/word/2023/wordml/word16du" xmlns:wne="http://schemas.microsoft.com/office/word/2006/wordml" mc:Ignorable="w14 w15 w16se w16cid w16 w16cex w16sdtdh w16sdtfl w16du wp14">
   <w:footnote w:type="separator" w:id="-1">
     <w:p>
       <w:r>
@@ -1185,7 +1959,7 @@
 </file>
 
 <file path=word/header1.xml><?xml version="1.0" encoding="utf-8"?>
-<w:hdr xmlns:wpc="http://schemas.microsoft.com/office/word/2010/wordprocessingCanvas" xmlns:cx="http://schemas.microsoft.com/office/drawing/2014/chartex" xmlns:cx1="http://schemas.microsoft.com/office/drawing/2015/9/8/chartex" xmlns:cx2="http://schemas.microsoft.com/office/drawing/2015/10/21/chartex" xmlns:cx3="http://schemas.microsoft.com/office/drawing/2016/5/9/chartex" xmlns:cx4="http://schemas.microsoft.com/office/drawing/2016/5/10/chartex" xmlns:cx5="http://schemas.microsoft.com/office/drawing/2016/5/11/chartex" xmlns:cx6="http://schemas.microsoft.com/office/drawing/2016/5/12/chartex" xmlns:cx7="http://schemas.microsoft.com/office/drawing/2016/5/13/chartex" xmlns:cx8="http://schemas.microsoft.com/office/drawing/2016/5/14/chartex" xmlns:mc="http://schemas.openxmlformats.org/markup-compatibility/2006" xmlns:aink="http://schemas.microsoft.com/office/drawing/2016/ink" xmlns:am3d="http://schemas.microsoft.com/office/drawing/2017/model3d" xmlns:o="urn:schemas-microsoft-com:office:office" xmlns:oel="http://schemas.microsoft.com/office/2019/extlst" xmlns:r="http://schemas.openxmlformats.org/officeDocument/2006/relationships" xmlns:m="http://schemas.openxmlformats.org/officeDocument/2006/math" xmlns:v="urn:schemas-microsoft-com:vml" xmlns:wp14="http://schemas.microsoft.com/office/word/2010/wordprocessingDrawing" xmlns:wp="http://schemas.openxmlformats.org/drawingml/2006/wordprocessingDrawing" xmlns:w10="urn:schemas-microsoft-com:office:word" xmlns:w="http://schemas.openxmlformats.org/wordprocessingml/2006/main" xmlns:w14="http://schemas.microsoft.com/office/word/2010/wordml" xmlns:w15="http://schemas.microsoft.com/office/word/2012/wordml" xmlns:w16cex="http://schemas.microsoft.com/office/word/2018/wordml/cex" xmlns:w16cid="http://schemas.microsoft.com/office/word/2016/wordml/cid" xmlns:w16="http://schemas.microsoft.com/office/word/2018/wordml" xmlns:w16du="http://schemas.microsoft.com/office/word/2023/wordml/word16du" xmlns:w16sdtdh="http://schemas.microsoft.com/office/word/2020/wordml/sdtdatahash" xmlns:w16sdtfl="http://schemas.microsoft.com/office/word/2024/wordml/sdtformatlock" xmlns:w16se="http://schemas.microsoft.com/office/word/2015/wordml/symex" xmlns:wpg="http://schemas.microsoft.com/office/word/2010/wordprocessingGroup" xmlns:wpi="http://schemas.microsoft.com/office/word/2010/wordprocessingInk" xmlns:wne="http://schemas.microsoft.com/office/word/2006/wordml" xmlns:wps="http://schemas.microsoft.com/office/word/2010/wordprocessingShape" mc:Ignorable="w14 w15 w16se w16cid w16 w16cex w16sdtdh w16sdtfl w16du wp14">
+<w:hdr xmlns:wpc="http://schemas.microsoft.com/office/word/2010/wordprocessingCanvas" xmlns:cx="http://schemas.microsoft.com/office/drawing/2014/chartex" xmlns:cx1="http://schemas.microsoft.com/office/drawing/2015/9/8/chartex" xmlns:cx2="http://schemas.microsoft.com/office/drawing/2015/10/21/chartex" xmlns:cx3="http://schemas.microsoft.com/office/drawing/2016/5/9/chartex" xmlns:cx4="http://schemas.microsoft.com/office/drawing/2016/5/10/chartex" xmlns:cx5="http://schemas.microsoft.com/office/drawing/2016/5/11/chartex" xmlns:cx6="http://schemas.microsoft.com/office/drawing/2016/5/12/chartex" xmlns:cx7="http://schemas.microsoft.com/office/drawing/2016/5/13/chartex" xmlns:cx8="http://schemas.microsoft.com/office/drawing/2016/5/14/chartex" xmlns:mc="http://schemas.openxmlformats.org/markup-compatibility/2006" xmlns:m="http://schemas.openxmlformats.org/officeDocument/2006/math" xmlns:aink="http://schemas.microsoft.com/office/drawing/2016/ink" xmlns:am3d="http://schemas.microsoft.com/office/drawing/2017/model3d" xmlns:oel="http://schemas.microsoft.com/office/2019/extlst" xmlns:r="http://schemas.openxmlformats.org/officeDocument/2006/relationships" xmlns:wp14="http://schemas.microsoft.com/office/word/2010/wordprocessingDrawing" xmlns:wp="http://schemas.openxmlformats.org/drawingml/2006/wordprocessingDrawing" xmlns:wpg="http://schemas.microsoft.com/office/word/2010/wordprocessingGroup" xmlns:wpi="http://schemas.microsoft.com/office/word/2010/wordprocessingInk" xmlns:wps="http://schemas.microsoft.com/office/word/2010/wordprocessingShape" xmlns:o="urn:schemas-microsoft-com:office:office" xmlns:v="urn:schemas-microsoft-com:vml" xmlns:w10="urn:schemas-microsoft-com:office:word" xmlns:w="http://schemas.openxmlformats.org/wordprocessingml/2006/main" xmlns:w14="http://schemas.microsoft.com/office/word/2010/wordml" xmlns:w15="http://schemas.microsoft.com/office/word/2012/wordml" xmlns:w16cex="http://schemas.microsoft.com/office/word/2018/wordml/cex" xmlns:w16cid="http://schemas.microsoft.com/office/word/2016/wordml/cid" xmlns:w16="http://schemas.microsoft.com/office/word/2018/wordml" xmlns:w16sdtdh="http://schemas.microsoft.com/office/word/2020/wordml/sdtdatahash" xmlns:w16sdtfl="http://schemas.microsoft.com/office/word/2024/wordml/sdtformatlock" xmlns:w16se="http://schemas.microsoft.com/office/word/2015/wordml/symex" xmlns:w16du="http://schemas.microsoft.com/office/word/2023/wordml/word16du" xmlns:wne="http://schemas.microsoft.com/office/word/2006/wordml" mc:Ignorable="w14 w15 w16se w16cid w16 w16cex w16sdtdh w16sdtfl w16du wp14">
   <w:p>
     <w:pPr>
       <w:pStyle w:val="Header"/>
@@ -1281,7 +2055,7 @@
 </file>
 
 <file path=word/numbering.xml><?xml version="1.0" encoding="utf-8"?>
-<w:numbering xmlns:wpc="http://schemas.microsoft.com/office/word/2010/wordprocessingCanvas" xmlns:cx="http://schemas.microsoft.com/office/drawing/2014/chartex" xmlns:cx1="http://schemas.microsoft.com/office/drawing/2015/9/8/chartex" xmlns:cx2="http://schemas.microsoft.com/office/drawing/2015/10/21/chartex" xmlns:cx3="http://schemas.microsoft.com/office/drawing/2016/5/9/chartex" xmlns:cx4="http://schemas.microsoft.com/office/drawing/2016/5/10/chartex" xmlns:cx5="http://schemas.microsoft.com/office/drawing/2016/5/11/chartex" xmlns:cx6="http://schemas.microsoft.com/office/drawing/2016/5/12/chartex" xmlns:cx7="http://schemas.microsoft.com/office/drawing/2016/5/13/chartex" xmlns:cx8="http://schemas.microsoft.com/office/drawing/2016/5/14/chartex" xmlns:mc="http://schemas.openxmlformats.org/markup-compatibility/2006" xmlns:aink="http://schemas.microsoft.com/office/drawing/2016/ink" xmlns:am3d="http://schemas.microsoft.com/office/drawing/2017/model3d" xmlns:o="urn:schemas-microsoft-com:office:office" xmlns:oel="http://schemas.microsoft.com/office/2019/extlst" xmlns:r="http://schemas.openxmlformats.org/officeDocument/2006/relationships" xmlns:m="http://schemas.openxmlformats.org/officeDocument/2006/math" xmlns:v="urn:schemas-microsoft-com:vml" xmlns:wp14="http://schemas.microsoft.com/office/word/2010/wordprocessingDrawing" xmlns:wp="http://schemas.openxmlformats.org/drawingml/2006/wordprocessingDrawing" xmlns:w10="urn:schemas-microsoft-com:office:word" xmlns:w="http://schemas.openxmlformats.org/wordprocessingml/2006/main" xmlns:w14="http://schemas.microsoft.com/office/word/2010/wordml" xmlns:w15="http://schemas.microsoft.com/office/word/2012/wordml" xmlns:w16cex="http://schemas.microsoft.com/office/word/2018/wordml/cex" xmlns:w16cid="http://schemas.microsoft.com/office/word/2016/wordml/cid" xmlns:w16="http://schemas.microsoft.com/office/word/2018/wordml" xmlns:w16du="http://schemas.microsoft.com/office/word/2023/wordml/word16du" xmlns:w16sdtdh="http://schemas.microsoft.com/office/word/2020/wordml/sdtdatahash" xmlns:w16sdtfl="http://schemas.microsoft.com/office/word/2024/wordml/sdtformatlock" xmlns:w16se="http://schemas.microsoft.com/office/word/2015/wordml/symex" xmlns:wpg="http://schemas.microsoft.com/office/word/2010/wordprocessingGroup" xmlns:wpi="http://schemas.microsoft.com/office/word/2010/wordprocessingInk" xmlns:wne="http://schemas.microsoft.com/office/word/2006/wordml" xmlns:wps="http://schemas.microsoft.com/office/word/2010/wordprocessingShape" mc:Ignorable="w14 w15 w16se w16cid w16 w16cex w16sdtdh w16sdtfl w16du wp14">
+<w:numbering xmlns:wpc="http://schemas.microsoft.com/office/word/2010/wordprocessingCanvas" xmlns:cx="http://schemas.microsoft.com/office/drawing/2014/chartex" xmlns:cx1="http://schemas.microsoft.com/office/drawing/2015/9/8/chartex" xmlns:cx2="http://schemas.microsoft.com/office/drawing/2015/10/21/chartex" xmlns:cx3="http://schemas.microsoft.com/office/drawing/2016/5/9/chartex" xmlns:cx4="http://schemas.microsoft.com/office/drawing/2016/5/10/chartex" xmlns:cx5="http://schemas.microsoft.com/office/drawing/2016/5/11/chartex" xmlns:cx6="http://schemas.microsoft.com/office/drawing/2016/5/12/chartex" xmlns:cx7="http://schemas.microsoft.com/office/drawing/2016/5/13/chartex" xmlns:cx8="http://schemas.microsoft.com/office/drawing/2016/5/14/chartex" xmlns:mc="http://schemas.openxmlformats.org/markup-compatibility/2006" xmlns:m="http://schemas.openxmlformats.org/officeDocument/2006/math" xmlns:aink="http://schemas.microsoft.com/office/drawing/2016/ink" xmlns:am3d="http://schemas.microsoft.com/office/drawing/2017/model3d" xmlns:oel="http://schemas.microsoft.com/office/2019/extlst" xmlns:r="http://schemas.openxmlformats.org/officeDocument/2006/relationships" xmlns:wp14="http://schemas.microsoft.com/office/word/2010/wordprocessingDrawing" xmlns:wp="http://schemas.openxmlformats.org/drawingml/2006/wordprocessingDrawing" xmlns:wpg="http://schemas.microsoft.com/office/word/2010/wordprocessingGroup" xmlns:wpi="http://schemas.microsoft.com/office/word/2010/wordprocessingInk" xmlns:wps="http://schemas.microsoft.com/office/word/2010/wordprocessingShape" xmlns:o="urn:schemas-microsoft-com:office:office" xmlns:v="urn:schemas-microsoft-com:vml" xmlns:w10="urn:schemas-microsoft-com:office:word" xmlns:w="http://schemas.openxmlformats.org/wordprocessingml/2006/main" xmlns:w14="http://schemas.microsoft.com/office/word/2010/wordml" xmlns:w15="http://schemas.microsoft.com/office/word/2012/wordml" xmlns:w16cex="http://schemas.microsoft.com/office/word/2018/wordml/cex" xmlns:w16cid="http://schemas.microsoft.com/office/word/2016/wordml/cid" xmlns:w16="http://schemas.microsoft.com/office/word/2018/wordml" xmlns:w16sdtdh="http://schemas.microsoft.com/office/word/2020/wordml/sdtdatahash" xmlns:w16sdtfl="http://schemas.microsoft.com/office/word/2024/wordml/sdtformatlock" xmlns:w16se="http://schemas.microsoft.com/office/word/2015/wordml/symex" xmlns:w16du="http://schemas.microsoft.com/office/word/2023/wordml/word16du" xmlns:wne="http://schemas.microsoft.com/office/word/2006/wordml" mc:Ignorable="w14 w15 w16se w16cid w16 w16cex w16sdtdh w16sdtfl w16du wp14">
   <w:abstractNum w:abstractNumId="0" w15:restartNumberingAfterBreak="0">
     <w:nsid w:val="088338B2"/>
     <w:multiLevelType w:val="multilevel"/>
@@ -1742,7 +2516,7 @@
 </file>
 
 <file path=word/styles.xml><?xml version="1.0" encoding="utf-8"?>
-<w:styles xmlns:mc="http://schemas.openxmlformats.org/markup-compatibility/2006" xmlns:r="http://schemas.openxmlformats.org/officeDocument/2006/relationships" xmlns:w="http://schemas.openxmlformats.org/wordprocessingml/2006/main" xmlns:w14="http://schemas.microsoft.com/office/word/2010/wordml" xmlns:w15="http://schemas.microsoft.com/office/word/2012/wordml" xmlns:w16cex="http://schemas.microsoft.com/office/word/2018/wordml/cex" xmlns:w16cid="http://schemas.microsoft.com/office/word/2016/wordml/cid" xmlns:w16="http://schemas.microsoft.com/office/word/2018/wordml" xmlns:w16du="http://schemas.microsoft.com/office/word/2023/wordml/word16du" xmlns:w16sdtdh="http://schemas.microsoft.com/office/word/2020/wordml/sdtdatahash" xmlns:w16sdtfl="http://schemas.microsoft.com/office/word/2024/wordml/sdtformatlock" xmlns:w16se="http://schemas.microsoft.com/office/word/2015/wordml/symex" mc:Ignorable="w14 w15 w16se w16cid w16 w16cex w16sdtdh w16sdtfl w16du">
+<w:styles xmlns:mc="http://schemas.openxmlformats.org/markup-compatibility/2006" xmlns:r="http://schemas.openxmlformats.org/officeDocument/2006/relationships" xmlns:w="http://schemas.openxmlformats.org/wordprocessingml/2006/main" xmlns:w14="http://schemas.microsoft.com/office/word/2010/wordml" xmlns:w15="http://schemas.microsoft.com/office/word/2012/wordml" xmlns:w16cex="http://schemas.microsoft.com/office/word/2018/wordml/cex" xmlns:w16cid="http://schemas.microsoft.com/office/word/2016/wordml/cid" xmlns:w16="http://schemas.microsoft.com/office/word/2018/wordml" xmlns:w16sdtdh="http://schemas.microsoft.com/office/word/2020/wordml/sdtdatahash" xmlns:w16sdtfl="http://schemas.microsoft.com/office/word/2024/wordml/sdtformatlock" xmlns:w16se="http://schemas.microsoft.com/office/word/2015/wordml/symex" xmlns:w16du="http://schemas.microsoft.com/office/word/2023/wordml/word16du" mc:Ignorable="w14 w15 w16se w16cid w16 w16cex w16sdtdh w16sdtfl w16du">
   <w:docDefaults>
     <w:rPrDefault>
       <w:rPr>

</xml_diff>